<commit_message>
copy(investors): real infrastructure costs, J.P. Morgan card, no In-Q-Tel on the page, erasure video
Burn is now ~$11,500-13,000/month: the Cloudflare Enterprise order form
($5,278.90/month, 16 Sep 2026), Google Cloud at $1,500-3,000/month now the
Google for Startups credit is spent, and ~$4,700 of other costs. Break-even
moves to ~$17,500-19,000. Updated in the page, the questions-answered HTML and
the executive summary .docx.

The J.P. Morgan Innovation Economy card loses its placeholder. In-Q-Tel is
removed from the page (the deeper documents are left as they are). The
compliance page's click-to-play video is reused here, same facade script.

Co-Authored-By: Claude Opus 5 (1M context) <noreply@anthropic.com>
</commit_message>
<xml_diff>
--- a/site/static/investors/docs/Divinci-Investor-Executive-Summary-v0.3.docx
+++ b/site/static/investors/docs/Divinci-Investor-Executive-Summary-v0.3.docx
@@ -1297,7 +1297,7 @@
           <w:sz-cs w:val="28"/>
           <w:spacing w:val="0"/>
         </w:rPr>
-        <w:t xml:space="preserve"> ~$5,000/month keep-the-lights-on expenses; founders currently draw no salary. </w:t>
+        <w:t xml:space="preserve"> ~$11,500–13,000/month going forward; founders currently draw no salary. That is the Cloudflare Enterprise contract at $5,278.90/month, Google Cloud at $1,500–3,000/month now that the Google for Startups credit is spent, and ~$4,700/month of other operating costs. </w:t>
       </w:r>
       <w:r>
         <w:rPr>
@@ -1316,7 +1316,7 @@
           <w:sz-cs w:val="28"/>
           <w:spacing w:val="0"/>
         </w:rPr>
-        <w:t xml:space="preserve"> ~$11,000/month — the $5,000 of expenses plus $2,000/month each for the three founders. Everything above that line is return.</w:t>
+        <w:t xml:space="preserve"> ~$17,500–19,000/month — that burn plus $2,000/month each for the three founders. Everything above that line is return.</w:t>
       </w:r>
     </w:p>
     <w:p>

</xml_diff>